<commit_message>
Programmes batch 7: AI & Machine Learning courses 27-34 (EN + FR)
Course 29 with its optional reinforcement-learning phase; maths boxes; cold-read
fixes (exam-domain coverage, SageMaker endpoint and batch transform wording,
lab costs, labs ordered after their topics). Security batch drafts included.

Co-Authored-By: Claude Opus 5.5 <noreply@anthropic.com>
</commit_message>
<xml_diff>
--- a/res/programmes/AWS-AI-Practitioner-and-Generative-AI-33h.docx
+++ b/res/programmes/AWS-AI-Practitioner-and-Generative-AI-33h.docx
@@ -808,7 +808,7 @@
               <w:pStyle w:val="ProgTableText"/>
             </w:pPr>
             <w:r>
-              <w:t>One laptop per participant with a browser; one AWS sandbox account per team with Bedrock model access enabled and a budget alert, provided by the organiser; knowledge bases and endpoints deleted at the end of each lab to control cost</w:t>
+              <w:t>One laptop per participant with a browser; one AWS sandbox account per team with a budget alert, provided by the organiser; Knowledge Bases on S3 Vectors; endpoints and vector stores deleted and Canvas logged out after each lab</w:t>
             </w:r>
           </w:p>
         </w:tc>
@@ -893,7 +893,7 @@
         <w:pStyle w:val="ProgIntro"/>
       </w:pPr>
       <w:r>
-        <w:t>Participants learn the vocabulary of AI and machine learning and the lifecycle of an ML project on AWS, then use ready-made services for images, text, documents, speech and translation without training a model. Validated lab: a document processed by Textract, its text analysed by Comprehend and its summary read aloud by Polly.</w:t>
+        <w:t>Participants learn the vocabulary of AI and machine learning and the lifecycle of an ML project on AWS, then use ready-made services for images, text, documents, speech and translation without training a model. Validated lab: a document processed by Textract, its entities and sentiment detected by Comprehend, and the result read aloud by Polly.</w:t>
       </w:r>
     </w:p>
     <w:tbl>
@@ -1015,7 +1015,7 @@
               <w:pStyle w:val="ProgTableText"/>
             </w:pPr>
             <w:r>
-              <w:t>Concepts, the ML lifecycle on AWS</w:t>
+              <w:t>AI, ML and deep learning; supervised, unsupervised and reinforcement learning; the ML lifecycle on AWS; model metrics (accuracy, F1, AUC) and business metrics</w:t>
             </w:r>
           </w:p>
         </w:tc>
@@ -1393,7 +1393,7 @@
               <w:pStyle w:val="ProgTableText"/>
             </w:pPr>
             <w:r>
-              <w:t>Models, playgrounds, Knowledge Bases (RAG), Agents, customisation</w:t>
+              <w:t>Models and playgrounds, inference parameters (temperature, top-p), Knowledge Bases (RAG) and vector stores on AWS, Agents, customisation (fine-tuning, continued pre-training, distillation), model evaluation (ROUGE, BLEU, BERTScore, human review)</w:t>
             </w:r>
           </w:p>
         </w:tc>
@@ -1637,7 +1637,7 @@
               <w:pStyle w:val="ProgTableText"/>
             </w:pPr>
             <w:r>
-              <w:t>Amazon Q Business and Q Developer use cases</w:t>
+              <w:t>Amazon Q Business and Amazon Q Developer use cases (exam scope); Amazon Quick Suite as the newer agentic workspace</w:t>
             </w:r>
           </w:p>
         </w:tc>
@@ -1704,7 +1704,7 @@
               <w:pStyle w:val="ProgTableText"/>
             </w:pPr>
             <w:r>
-              <w:t>Bias, transparency, Bedrock Guardrails, SageMaker Clarify</w:t>
+              <w:t>Bias, transparency, Bedrock Guardrails, SageMaker Clarify, Amazon A2I human review, SageMaker Model Cards</w:t>
             </w:r>
           </w:p>
         </w:tc>
@@ -1771,7 +1771,7 @@
               <w:pStyle w:val="ProgTableText"/>
             </w:pPr>
             <w:r>
-              <w:t>Data privacy, compliance for AI workloads</w:t>
+              <w:t>Shared responsibility, IAM, encryption, Macie, PrivateLink, CloudTrail, AWS Config, Audit Manager, AWS Artifact, data lineage</w:t>
             </w:r>
           </w:p>
         </w:tc>

</xml_diff>

<commit_message>
Programmes: vector logo and cover tiles (sharp PDFs); all modals one size, no sideways scroll
- build_programmes.py: logo from res/logo.svg; logo and cover tile band embedded as SVG
  (Word svgBlip, PNG fallback), so Word exports them to PDF as vectors. Before, Word
  resampled the PNGs to ~200 ppi and the 118 px logo looked pixelated. Also turns off
  picture compression per document. All 78 .docx rebuilt, 78 PDFs re-exported (print quality).
- Modals: same fixed box for contact and programme dialogs, content scrolls inside,
  long programme titles wrap (they forced horizontal scrolling).

Co-Authored-By: Claude Opus 5.5 <noreply@anthropic.com>
</commit_message>
<xml_diff>
--- a/res/programmes/AWS-AI-Practitioner-and-Generative-AI-33h.docx
+++ b/res/programmes/AWS-AI-Practitioner-and-Generative-AI-33h.docx
@@ -32,7 +32,13 @@
                     <pic:cNvPicPr/>
                   </pic:nvPicPr>
                   <pic:blipFill>
-                    <a:blip r:embed="rId12"/>
+                    <a:blip r:embed="rId12">
+                      <a:extLst>
+                        <a:ext uri="{96DAC541-7B7A-43D3-8B79-37D633B846F1}">
+                          <asvg:svgBlip xmlns:asvg="http://schemas.microsoft.com/office/drawing/2016/SVG/main" r:embed="rId13"/>
+                        </a:ext>
+                      </a:extLst>
+                    </a:blip>
                     <a:stretch>
                       <a:fillRect/>
                     </a:stretch>
@@ -132,7 +138,7 @@
             <w:r>
               <w:drawing>
                 <wp:inline xmlns:a="http://schemas.openxmlformats.org/drawingml/2006/main" xmlns:pic="http://schemas.openxmlformats.org/drawingml/2006/picture">
-                  <wp:extent cx="516649" cy="486000"/>
+                  <wp:extent cx="516563" cy="486000"/>
                   <wp:docPr id="901" name="Picture 901"/>
                   <wp:cNvGraphicFramePr>
                     <a:graphicFrameLocks noChangeAspect="1"/>
@@ -145,7 +151,13 @@
                           <pic:cNvPicPr/>
                         </pic:nvPicPr>
                         <pic:blipFill>
-                          <a:blip r:embed="rId13"/>
+                          <a:blip r:embed="rId14">
+                            <a:extLst>
+                              <a:ext uri="{96DAC541-7B7A-43D3-8B79-37D633B846F1}">
+                                <asvg:svgBlip xmlns:asvg="http://schemas.microsoft.com/office/drawing/2016/SVG/main" r:embed="rId15"/>
+                              </a:ext>
+                            </a:extLst>
+                          </a:blip>
                           <a:stretch>
                             <a:fillRect/>
                           </a:stretch>
@@ -153,7 +165,7 @@
                         <pic:spPr>
                           <a:xfrm>
                             <a:off x="0" y="0"/>
-                            <a:ext cx="516649" cy="486000"/>
+                            <a:ext cx="516563" cy="486000"/>
                           </a:xfrm>
                           <a:prstGeom prst="rect"/>
                         </pic:spPr>
@@ -2262,7 +2274,7 @@
     <w:r>
       <w:drawing>
         <wp:inline xmlns:a="http://schemas.openxmlformats.org/drawingml/2006/main" xmlns:pic="http://schemas.openxmlformats.org/drawingml/2006/picture">
-          <wp:extent cx="114811" cy="108000"/>
+          <wp:extent cx="114792" cy="108000"/>
           <wp:docPr id="1" name="Picture 1"/>
           <wp:cNvGraphicFramePr>
             <a:graphicFrameLocks noChangeAspect="1"/>
@@ -2275,7 +2287,13 @@
                   <pic:cNvPicPr/>
                 </pic:nvPicPr>
                 <pic:blipFill>
-                  <a:blip r:embed="rId1"/>
+                  <a:blip r:embed="rId1">
+                    <a:extLst>
+                      <a:ext uri="{96DAC541-7B7A-43D3-8B79-37D633B846F1}">
+                        <asvg:svgBlip xmlns:asvg="http://schemas.microsoft.com/office/drawing/2016/SVG/main" r:embed="rId2"/>
+                      </a:ext>
+                    </a:extLst>
+                  </a:blip>
                   <a:stretch>
                     <a:fillRect/>
                   </a:stretch>
@@ -2283,7 +2301,7 @@
                 <pic:spPr>
                   <a:xfrm>
                     <a:off x="0" y="0"/>
-                    <a:ext cx="114811" cy="108000"/>
+                    <a:ext cx="114792" cy="108000"/>
                   </a:xfrm>
                   <a:prstGeom prst="rect"/>
                 </pic:spPr>

</xml_diff>